<commit_message>
docs: tool inventory table in the detailed README (all base, session-bash, web/video, and per-turn attached tools)
</commit_message>
<xml_diff>
--- a/docs/README-详细版.docx
+++ b/docs/README-详细版.docx
@@ -4092,6 +4092,1249 @@
         <w:t>设计与实施记录）。</w:t>
       </w:r>
     </w:p>
+    <w:p>
+      <w:pPr>
+        <w:pStyle w:val="21"/>
+      </w:pPr>
+      <w:r>
+        <w:t>Agent 工具一览</w:t>
+      </w:r>
+    </w:p>
+    <w:p>
+      <w:r>
+        <w:t>每个 Agent 按层拿到一份工具白名单：L1 调度者拿全部，L2 执行者拿基础+执行类，L3 工人只拿基础文件工具。基础工具写死在代码里，其余按回合挂载（MCP 按配置动态）。</w:t>
+      </w:r>
+    </w:p>
+    <w:tbl>
+      <w:tblPr>
+        <w:tblStyle w:val="-11"/>
+        <w:tblW w:type="auto" w:w="0"/>
+        <w:tblLook w:firstColumn="1" w:firstRow="1" w:lastColumn="0" w:lastRow="0" w:noHBand="0" w:noVBand="1" w:val="04A0"/>
+      </w:tblPr>
+      <w:tblGrid>
+        <w:gridCol w:w="2880"/>
+        <w:gridCol w:w="2880"/>
+        <w:gridCol w:w="2880"/>
+      </w:tblGrid>
+      <w:tr>
+        <w:tc>
+          <w:tcPr>
+            <w:tcW w:type="dxa" w:w="2880"/>
+          </w:tcPr>
+          <w:p>
+            <w:r>
+              <w:rPr>
+                <w:b/>
+                <w:sz w:val="21"/>
+              </w:rPr>
+            </w:r>
+            <w:r>
+              <w:rPr>
+                <w:b/>
+                <w:sz w:val="21"/>
+              </w:rPr>
+              <w:t>工具</w:t>
+            </w:r>
+          </w:p>
+        </w:tc>
+        <w:tc>
+          <w:tcPr>
+            <w:tcW w:type="dxa" w:w="2880"/>
+          </w:tcPr>
+          <w:p>
+            <w:r>
+              <w:rPr>
+                <w:b/>
+                <w:sz w:val="21"/>
+              </w:rPr>
+            </w:r>
+            <w:r>
+              <w:rPr>
+                <w:b/>
+                <w:sz w:val="21"/>
+              </w:rPr>
+              <w:t>适用层</w:t>
+            </w:r>
+          </w:p>
+        </w:tc>
+        <w:tc>
+          <w:tcPr>
+            <w:tcW w:type="dxa" w:w="2880"/>
+          </w:tcPr>
+          <w:p>
+            <w:r>
+              <w:rPr>
+                <w:b/>
+                <w:sz w:val="21"/>
+              </w:rPr>
+            </w:r>
+            <w:r>
+              <w:rPr>
+                <w:b/>
+                <w:sz w:val="21"/>
+              </w:rPr>
+              <w:t>功能</w:t>
+            </w:r>
+          </w:p>
+        </w:tc>
+      </w:tr>
+      <w:tr>
+        <w:tc>
+          <w:tcPr>
+            <w:tcW w:type="dxa" w:w="2880"/>
+          </w:tcPr>
+          <w:p>
+            <w:r>
+              <w:rPr>
+                <w:sz w:val="21"/>
+              </w:rPr>
+            </w:r>
+            <w:r>
+              <w:rPr>
+                <w:b w:val="0"/>
+                <w:sz w:val="21"/>
+              </w:rPr>
+              <w:t>read</w:t>
+            </w:r>
+          </w:p>
+        </w:tc>
+        <w:tc>
+          <w:tcPr>
+            <w:tcW w:type="dxa" w:w="2880"/>
+          </w:tcPr>
+          <w:p>
+            <w:r>
+              <w:rPr>
+                <w:sz w:val="21"/>
+              </w:rPr>
+            </w:r>
+            <w:r>
+              <w:rPr>
+                <w:b w:val="0"/>
+                <w:sz w:val="21"/>
+              </w:rPr>
+              <w:t>全部</w:t>
+            </w:r>
+          </w:p>
+        </w:tc>
+        <w:tc>
+          <w:tcPr>
+            <w:tcW w:type="dxa" w:w="2880"/>
+          </w:tcPr>
+          <w:p>
+            <w:r>
+              <w:rPr>
+                <w:sz w:val="21"/>
+              </w:rPr>
+            </w:r>
+            <w:r>
+              <w:rPr>
+                <w:b w:val="0"/>
+                <w:sz w:val="21"/>
+              </w:rPr>
+              <w:t>读文件，带行号；`:N` 单行、`:N-M` 区间。图片（png/jpg/…）直接作为图像附件给视觉模型，而不是文字。</w:t>
+            </w:r>
+          </w:p>
+        </w:tc>
+      </w:tr>
+      <w:tr>
+        <w:tc>
+          <w:tcPr>
+            <w:tcW w:type="dxa" w:w="2880"/>
+          </w:tcPr>
+          <w:p>
+            <w:r>
+              <w:rPr>
+                <w:sz w:val="21"/>
+              </w:rPr>
+            </w:r>
+            <w:r>
+              <w:rPr>
+                <w:b w:val="0"/>
+                <w:sz w:val="21"/>
+              </w:rPr>
+              <w:t>write</w:t>
+            </w:r>
+          </w:p>
+        </w:tc>
+        <w:tc>
+          <w:tcPr>
+            <w:tcW w:type="dxa" w:w="2880"/>
+          </w:tcPr>
+          <w:p>
+            <w:r>
+              <w:rPr>
+                <w:sz w:val="21"/>
+              </w:rPr>
+            </w:r>
+            <w:r>
+              <w:rPr>
+                <w:b w:val="0"/>
+                <w:sz w:val="21"/>
+              </w:rPr>
+              <w:t>全部</w:t>
+            </w:r>
+          </w:p>
+        </w:tc>
+        <w:tc>
+          <w:tcPr>
+            <w:tcW w:type="dxa" w:w="2880"/>
+          </w:tcPr>
+          <w:p>
+            <w:r>
+              <w:rPr>
+                <w:sz w:val="21"/>
+              </w:rPr>
+            </w:r>
+            <w:r>
+              <w:rPr>
+                <w:b w:val="0"/>
+                <w:sz w:val="21"/>
+              </w:rPr>
+              <w:t>新建或整体覆盖一个文件。</w:t>
+            </w:r>
+          </w:p>
+        </w:tc>
+      </w:tr>
+      <w:tr>
+        <w:tc>
+          <w:tcPr>
+            <w:tcW w:type="dxa" w:w="2880"/>
+          </w:tcPr>
+          <w:p>
+            <w:r>
+              <w:rPr>
+                <w:sz w:val="21"/>
+              </w:rPr>
+            </w:r>
+            <w:r>
+              <w:rPr>
+                <w:b w:val="0"/>
+                <w:sz w:val="21"/>
+              </w:rPr>
+              <w:t>edit</w:t>
+            </w:r>
+          </w:p>
+        </w:tc>
+        <w:tc>
+          <w:tcPr>
+            <w:tcW w:type="dxa" w:w="2880"/>
+          </w:tcPr>
+          <w:p>
+            <w:r>
+              <w:rPr>
+                <w:sz w:val="21"/>
+              </w:rPr>
+            </w:r>
+            <w:r>
+              <w:rPr>
+                <w:b w:val="0"/>
+                <w:sz w:val="21"/>
+              </w:rPr>
+              <w:t>全部</w:t>
+            </w:r>
+          </w:p>
+        </w:tc>
+        <w:tc>
+          <w:tcPr>
+            <w:tcW w:type="dxa" w:w="2880"/>
+          </w:tcPr>
+          <w:p>
+            <w:r>
+              <w:rPr>
+                <w:sz w:val="21"/>
+              </w:rPr>
+            </w:r>
+            <w:r>
+              <w:rPr>
+                <w:b w:val="0"/>
+                <w:sz w:val="21"/>
+              </w:rPr>
+              <w:t>精确替换：old_string 必须与文件内容完全一致且唯一，否则报错——防止误伤别处。</w:t>
+            </w:r>
+          </w:p>
+        </w:tc>
+      </w:tr>
+      <w:tr>
+        <w:tc>
+          <w:tcPr>
+            <w:tcW w:type="dxa" w:w="2880"/>
+          </w:tcPr>
+          <w:p>
+            <w:r>
+              <w:rPr>
+                <w:sz w:val="21"/>
+              </w:rPr>
+            </w:r>
+            <w:r>
+              <w:rPr>
+                <w:b w:val="0"/>
+                <w:sz w:val="21"/>
+              </w:rPr>
+              <w:t>glob</w:t>
+            </w:r>
+          </w:p>
+        </w:tc>
+        <w:tc>
+          <w:tcPr>
+            <w:tcW w:type="dxa" w:w="2880"/>
+          </w:tcPr>
+          <w:p>
+            <w:r>
+              <w:rPr>
+                <w:sz w:val="21"/>
+              </w:rPr>
+            </w:r>
+            <w:r>
+              <w:rPr>
+                <w:b w:val="0"/>
+                <w:sz w:val="21"/>
+              </w:rPr>
+              <w:t>全部</w:t>
+            </w:r>
+          </w:p>
+        </w:tc>
+        <w:tc>
+          <w:tcPr>
+            <w:tcW w:type="dxa" w:w="2880"/>
+          </w:tcPr>
+          <w:p>
+            <w:r>
+              <w:rPr>
+                <w:sz w:val="21"/>
+              </w:rPr>
+            </w:r>
+            <w:r>
+              <w:rPr>
+                <w:b w:val="0"/>
+                <w:sz w:val="21"/>
+              </w:rPr>
+              <w:t>按通配模式找文件（如 `</w:t>
+            </w:r>
+            <w:r>
+              <w:rPr>
+                <w:b/>
+                <w:sz w:val="21"/>
+              </w:rPr>
+              <w:t>/*.py`），结果按修改时间新→旧。</w:t>
+            </w:r>
+          </w:p>
+        </w:tc>
+      </w:tr>
+      <w:tr>
+        <w:tc>
+          <w:tcPr>
+            <w:tcW w:type="dxa" w:w="2880"/>
+          </w:tcPr>
+          <w:p>
+            <w:r>
+              <w:rPr>
+                <w:sz w:val="21"/>
+              </w:rPr>
+            </w:r>
+            <w:r>
+              <w:rPr>
+                <w:b w:val="0"/>
+                <w:sz w:val="21"/>
+              </w:rPr>
+              <w:t>grep</w:t>
+            </w:r>
+          </w:p>
+        </w:tc>
+        <w:tc>
+          <w:tcPr>
+            <w:tcW w:type="dxa" w:w="2880"/>
+          </w:tcPr>
+          <w:p>
+            <w:r>
+              <w:rPr>
+                <w:sz w:val="21"/>
+              </w:rPr>
+            </w:r>
+            <w:r>
+              <w:rPr>
+                <w:b w:val="0"/>
+                <w:sz w:val="21"/>
+              </w:rPr>
+              <w:t>全部</w:t>
+            </w:r>
+          </w:p>
+        </w:tc>
+        <w:tc>
+          <w:tcPr>
+            <w:tcW w:type="dxa" w:w="2880"/>
+          </w:tcPr>
+          <w:p>
+            <w:r>
+              <w:rPr>
+                <w:sz w:val="21"/>
+              </w:rPr>
+            </w:r>
+            <w:r>
+              <w:rPr>
+                <w:b w:val="0"/>
+                <w:sz w:val="21"/>
+              </w:rPr>
+              <w:t>正则搜索文件内容，返回 `file:line:match`。跨目录、跨文件。</w:t>
+            </w:r>
+          </w:p>
+        </w:tc>
+      </w:tr>
+      <w:tr>
+        <w:tc>
+          <w:tcPr>
+            <w:tcW w:type="dxa" w:w="2880"/>
+          </w:tcPr>
+          <w:p>
+            <w:r>
+              <w:rPr>
+                <w:sz w:val="21"/>
+              </w:rPr>
+            </w:r>
+            <w:r>
+              <w:rPr>
+                <w:b w:val="0"/>
+                <w:sz w:val="21"/>
+              </w:rPr>
+              <w:t>bash</w:t>
+            </w:r>
+          </w:p>
+        </w:tc>
+        <w:tc>
+          <w:tcPr>
+            <w:tcW w:type="dxa" w:w="2880"/>
+          </w:tcPr>
+          <w:p>
+            <w:r>
+              <w:rPr>
+                <w:sz w:val="21"/>
+              </w:rPr>
+            </w:r>
+            <w:r>
+              <w:rPr>
+                <w:b w:val="0"/>
+                <w:sz w:val="21"/>
+              </w:rPr>
+              <w:t>全部</w:t>
+            </w:r>
+          </w:p>
+        </w:tc>
+        <w:tc>
+          <w:tcPr>
+            <w:tcW w:type="dxa" w:w="2880"/>
+          </w:tcPr>
+          <w:p>
+            <w:r>
+              <w:rPr>
+                <w:sz w:val="21"/>
+              </w:rPr>
+            </w:r>
+            <w:r>
+              <w:rPr>
+                <w:b w:val="0"/>
+                <w:sz w:val="21"/>
+              </w:rPr>
+              <w:t>cmd.exe 跑一条命令，600 秒硬超时。stdin 接 NUL：交互命令（裸 date / pause / REPL）读到 EOF 立即退出，不会挂住回合。cmd 会吃内层双引号——嵌套一律用单引号。</w:t>
+            </w:r>
+          </w:p>
+        </w:tc>
+      </w:tr>
+      <w:tr>
+        <w:tc>
+          <w:tcPr>
+            <w:tcW w:type="dxa" w:w="2880"/>
+          </w:tcPr>
+          <w:p>
+            <w:r>
+              <w:rPr>
+                <w:sz w:val="21"/>
+              </w:rPr>
+            </w:r>
+            <w:r>
+              <w:rPr>
+                <w:b w:val="0"/>
+                <w:sz w:val="21"/>
+              </w:rPr>
+              <w:t>bash_start</w:t>
+            </w:r>
+          </w:p>
+        </w:tc>
+        <w:tc>
+          <w:tcPr>
+            <w:tcW w:type="dxa" w:w="2880"/>
+          </w:tcPr>
+          <w:p>
+            <w:r>
+              <w:rPr>
+                <w:sz w:val="21"/>
+              </w:rPr>
+            </w:r>
+            <w:r>
+              <w:rPr>
+                <w:b w:val="0"/>
+                <w:sz w:val="21"/>
+              </w:rPr>
+              <w:t>L1/L2</w:t>
+            </w:r>
+          </w:p>
+        </w:tc>
+        <w:tc>
+          <w:tcPr>
+            <w:tcW w:type="dxa" w:w="2880"/>
+          </w:tcPr>
+          <w:p>
+            <w:r>
+              <w:rPr>
+                <w:sz w:val="21"/>
+              </w:rPr>
+            </w:r>
+            <w:r>
+              <w:rPr>
+                <w:b w:val="0"/>
+                <w:sz w:val="21"/>
+              </w:rPr>
+              <w:t>把命令启动为</w:t>
+            </w:r>
+            <w:r>
+              <w:rPr>
+                <w:b/>
+                <w:sz w:val="21"/>
+              </w:rPr>
+              <w:t>后台会话</w:t>
+            </w:r>
+            <w:r>
+              <w:rPr>
+                <w:b w:val="0"/>
+                <w:sz w:val="21"/>
+              </w:rPr>
+              <w:t>并立即返回会话 id 和首波输出。默认 stdin=NUL；传 `stdin_arg:'pipe'` 则可与进程交互（dev server、watch、REPL、多步安装器）。输出持续累积。</w:t>
+            </w:r>
+          </w:p>
+        </w:tc>
+      </w:tr>
+      <w:tr>
+        <w:tc>
+          <w:tcPr>
+            <w:tcW w:type="dxa" w:w="2880"/>
+          </w:tcPr>
+          <w:p>
+            <w:r>
+              <w:rPr>
+                <w:sz w:val="21"/>
+              </w:rPr>
+            </w:r>
+            <w:r>
+              <w:rPr>
+                <w:b w:val="0"/>
+                <w:sz w:val="21"/>
+              </w:rPr>
+              <w:t>bash_send</w:t>
+            </w:r>
+          </w:p>
+        </w:tc>
+        <w:tc>
+          <w:tcPr>
+            <w:tcW w:type="dxa" w:w="2880"/>
+          </w:tcPr>
+          <w:p>
+            <w:r>
+              <w:rPr>
+                <w:sz w:val="21"/>
+              </w:rPr>
+            </w:r>
+            <w:r>
+              <w:rPr>
+                <w:b w:val="0"/>
+                <w:sz w:val="21"/>
+              </w:rPr>
+              <w:t>L1/L2</w:t>
+            </w:r>
+          </w:p>
+        </w:tc>
+        <w:tc>
+          <w:tcPr>
+            <w:tcW w:type="dxa" w:w="2880"/>
+          </w:tcPr>
+          <w:p>
+            <w:r>
+              <w:rPr>
+                <w:sz w:val="21"/>
+              </w:rPr>
+            </w:r>
+            <w:r>
+              <w:rPr>
+                <w:b w:val="0"/>
+                <w:sz w:val="21"/>
+              </w:rPr>
+              <w:t>向 bash_start 会话（pipe 模式）喂</w:t>
+            </w:r>
+            <w:r>
+              <w:rPr>
+                <w:b/>
+                <w:sz w:val="21"/>
+              </w:rPr>
+              <w:t>一行</w:t>
+            </w:r>
+            <w:r>
+              <w:rPr>
+                <w:b w:val="0"/>
+                <w:sz w:val="21"/>
+              </w:rPr>
+              <w:t>输入，返回进程的响应（最多等 ~2s）。换行自动补。REPL 式读→写交互靠它与 bash_start 组合。</w:t>
+            </w:r>
+          </w:p>
+        </w:tc>
+      </w:tr>
+      <w:tr>
+        <w:tc>
+          <w:tcPr>
+            <w:tcW w:type="dxa" w:w="2880"/>
+          </w:tcPr>
+          <w:p>
+            <w:r>
+              <w:rPr>
+                <w:sz w:val="21"/>
+              </w:rPr>
+            </w:r>
+            <w:r>
+              <w:rPr>
+                <w:b w:val="0"/>
+                <w:sz w:val="21"/>
+              </w:rPr>
+              <w:t>bash_kill</w:t>
+            </w:r>
+          </w:p>
+        </w:tc>
+        <w:tc>
+          <w:tcPr>
+            <w:tcW w:type="dxa" w:w="2880"/>
+          </w:tcPr>
+          <w:p>
+            <w:r>
+              <w:rPr>
+                <w:sz w:val="21"/>
+              </w:rPr>
+            </w:r>
+            <w:r>
+              <w:rPr>
+                <w:b w:val="0"/>
+                <w:sz w:val="21"/>
+              </w:rPr>
+              <w:t>L1/L2</w:t>
+            </w:r>
+          </w:p>
+        </w:tc>
+        <w:tc>
+          <w:tcPr>
+            <w:tcW w:type="dxa" w:w="2880"/>
+          </w:tcPr>
+          <w:p>
+            <w:r>
+              <w:rPr>
+                <w:sz w:val="21"/>
+              </w:rPr>
+            </w:r>
+            <w:r>
+              <w:rPr>
+                <w:b w:val="0"/>
+                <w:sz w:val="21"/>
+              </w:rPr>
+              <w:t>杀掉一个会话的整棵进程树。会话在回合结束、/stop 或闲置 10 分钟后也会被自动收割，不留孤儿进程。</w:t>
+            </w:r>
+          </w:p>
+        </w:tc>
+      </w:tr>
+      <w:tr>
+        <w:tc>
+          <w:tcPr>
+            <w:tcW w:type="dxa" w:w="2880"/>
+          </w:tcPr>
+          <w:p>
+            <w:r>
+              <w:rPr>
+                <w:sz w:val="21"/>
+              </w:rPr>
+            </w:r>
+            <w:r>
+              <w:rPr>
+                <w:b w:val="0"/>
+                <w:sz w:val="21"/>
+              </w:rPr>
+              <w:t>web</w:t>
+            </w:r>
+          </w:p>
+        </w:tc>
+        <w:tc>
+          <w:tcPr>
+            <w:tcW w:type="dxa" w:w="2880"/>
+          </w:tcPr>
+          <w:p>
+            <w:r>
+              <w:rPr>
+                <w:sz w:val="21"/>
+              </w:rPr>
+            </w:r>
+            <w:r>
+              <w:rPr>
+                <w:b w:val="0"/>
+                <w:sz w:val="21"/>
+              </w:rPr>
+              <w:t>L1/L2</w:t>
+            </w:r>
+          </w:p>
+        </w:tc>
+        <w:tc>
+          <w:tcPr>
+            <w:tcW w:type="dxa" w:w="2880"/>
+          </w:tcPr>
+          <w:p>
+            <w:r>
+              <w:rPr>
+                <w:sz w:val="21"/>
+              </w:rPr>
+            </w:r>
+            <w:r>
+              <w:rPr>
+                <w:b w:val="0"/>
+                <w:sz w:val="21"/>
+              </w:rPr>
+              <w:t>抓取一个网页，返回正文文本。</w:t>
+            </w:r>
+          </w:p>
+        </w:tc>
+      </w:tr>
+      <w:tr>
+        <w:tc>
+          <w:tcPr>
+            <w:tcW w:type="dxa" w:w="2880"/>
+          </w:tcPr>
+          <w:p>
+            <w:r>
+              <w:rPr>
+                <w:sz w:val="21"/>
+              </w:rPr>
+            </w:r>
+            <w:r>
+              <w:rPr>
+                <w:b w:val="0"/>
+                <w:sz w:val="21"/>
+              </w:rPr>
+              <w:t>web_search</w:t>
+            </w:r>
+          </w:p>
+        </w:tc>
+        <w:tc>
+          <w:tcPr>
+            <w:tcW w:type="dxa" w:w="2880"/>
+          </w:tcPr>
+          <w:p>
+            <w:r>
+              <w:rPr>
+                <w:sz w:val="21"/>
+              </w:rPr>
+            </w:r>
+            <w:r>
+              <w:rPr>
+                <w:b w:val="0"/>
+                <w:sz w:val="21"/>
+              </w:rPr>
+              <w:t>L1/L2</w:t>
+            </w:r>
+          </w:p>
+        </w:tc>
+        <w:tc>
+          <w:tcPr>
+            <w:tcW w:type="dxa" w:w="2880"/>
+          </w:tcPr>
+          <w:p>
+            <w:r>
+              <w:rPr>
+                <w:sz w:val="21"/>
+              </w:rPr>
+            </w:r>
+            <w:r>
+              <w:rPr>
+                <w:b w:val="0"/>
+                <w:sz w:val="21"/>
+              </w:rPr>
+              <w:t>联网搜索，返回标题、URL 与摘要。</w:t>
+            </w:r>
+          </w:p>
+        </w:tc>
+      </w:tr>
+      <w:tr>
+        <w:tc>
+          <w:tcPr>
+            <w:tcW w:type="dxa" w:w="2880"/>
+          </w:tcPr>
+          <w:p>
+            <w:r>
+              <w:rPr>
+                <w:sz w:val="21"/>
+              </w:rPr>
+            </w:r>
+            <w:r>
+              <w:rPr>
+                <w:b w:val="0"/>
+                <w:sz w:val="21"/>
+              </w:rPr>
+              <w:t>video</w:t>
+            </w:r>
+          </w:p>
+        </w:tc>
+        <w:tc>
+          <w:tcPr>
+            <w:tcW w:type="dxa" w:w="2880"/>
+          </w:tcPr>
+          <w:p>
+            <w:r>
+              <w:rPr>
+                <w:sz w:val="21"/>
+              </w:rPr>
+            </w:r>
+            <w:r>
+              <w:rPr>
+                <w:b w:val="0"/>
+                <w:sz w:val="21"/>
+              </w:rPr>
+              <w:t>L1/L2</w:t>
+            </w:r>
+          </w:p>
+        </w:tc>
+        <w:tc>
+          <w:tcPr>
+            <w:tcW w:type="dxa" w:w="2880"/>
+          </w:tcPr>
+          <w:p>
+            <w:r>
+              <w:rPr>
+                <w:sz w:val="21"/>
+              </w:rPr>
+            </w:r>
+            <w:r>
+              <w:rPr>
+                <w:b w:val="0"/>
+                <w:sz w:val="21"/>
+              </w:rPr>
+              <w:t>本地视频理解：时间戳转录 + 场景切分 + 关键帧图像。`demo` 路径跑内置测试片自检整条管线。</w:t>
+            </w:r>
+          </w:p>
+        </w:tc>
+      </w:tr>
+      <w:tr>
+        <w:tc>
+          <w:tcPr>
+            <w:tcW w:type="dxa" w:w="2880"/>
+          </w:tcPr>
+          <w:p>
+            <w:r>
+              <w:rPr>
+                <w:sz w:val="21"/>
+              </w:rPr>
+            </w:r>
+            <w:r>
+              <w:rPr>
+                <w:b w:val="0"/>
+                <w:sz w:val="21"/>
+              </w:rPr>
+              <w:t>spawn</w:t>
+            </w:r>
+          </w:p>
+        </w:tc>
+        <w:tc>
+          <w:tcPr>
+            <w:tcW w:type="dxa" w:w="2880"/>
+          </w:tcPr>
+          <w:p>
+            <w:r>
+              <w:rPr>
+                <w:sz w:val="21"/>
+              </w:rPr>
+            </w:r>
+            <w:r>
+              <w:rPr>
+                <w:b w:val="0"/>
+                <w:sz w:val="21"/>
+              </w:rPr>
+              <w:t>回合挂载</w:t>
+            </w:r>
+          </w:p>
+        </w:tc>
+        <w:tc>
+          <w:tcPr>
+            <w:tcW w:type="dxa" w:w="2880"/>
+          </w:tcPr>
+          <w:p>
+            <w:r>
+              <w:rPr>
+                <w:sz w:val="21"/>
+              </w:rPr>
+            </w:r>
+            <w:r>
+              <w:rPr>
+                <w:b w:val="0"/>
+                <w:sz w:val="21"/>
+              </w:rPr>
+              <w:t>往下一层派一个子 Agent（L1→L2→L3）。立即返回 dispatched，报告在之后的回合注入，不占当前回合。可限时。</w:t>
+            </w:r>
+          </w:p>
+        </w:tc>
+      </w:tr>
+      <w:tr>
+        <w:tc>
+          <w:tcPr>
+            <w:tcW w:type="dxa" w:w="2880"/>
+          </w:tcPr>
+          <w:p>
+            <w:r>
+              <w:rPr>
+                <w:sz w:val="21"/>
+              </w:rPr>
+            </w:r>
+            <w:r>
+              <w:rPr>
+                <w:b w:val="0"/>
+                <w:sz w:val="21"/>
+              </w:rPr>
+              <w:t>background</w:t>
+            </w:r>
+          </w:p>
+        </w:tc>
+        <w:tc>
+          <w:tcPr>
+            <w:tcW w:type="dxa" w:w="2880"/>
+          </w:tcPr>
+          <w:p>
+            <w:r>
+              <w:rPr>
+                <w:sz w:val="21"/>
+              </w:rPr>
+            </w:r>
+            <w:r>
+              <w:rPr>
+                <w:b w:val="0"/>
+                <w:sz w:val="21"/>
+              </w:rPr>
+              <w:t>回合挂载</w:t>
+            </w:r>
+          </w:p>
+        </w:tc>
+        <w:tc>
+          <w:tcPr>
+            <w:tcW w:type="dxa" w:w="2880"/>
+          </w:tcPr>
+          <w:p>
+            <w:r>
+              <w:rPr>
+                <w:sz w:val="21"/>
+              </w:rPr>
+            </w:r>
+            <w:r>
+              <w:rPr>
+                <w:b w:val="0"/>
+                <w:sz w:val="21"/>
+              </w:rPr>
+              <w:t>后台跑一条 shell 命令（装依赖、构建、长测试），立刻返回；完成后输出以【后台报告】的形式进入新回合。可限时。</w:t>
+            </w:r>
+          </w:p>
+        </w:tc>
+      </w:tr>
+      <w:tr>
+        <w:tc>
+          <w:tcPr>
+            <w:tcW w:type="dxa" w:w="2880"/>
+          </w:tcPr>
+          <w:p>
+            <w:r>
+              <w:rPr>
+                <w:sz w:val="21"/>
+              </w:rPr>
+            </w:r>
+            <w:r>
+              <w:rPr>
+                <w:b w:val="0"/>
+                <w:sz w:val="21"/>
+              </w:rPr>
+              <w:t>inquire</w:t>
+            </w:r>
+          </w:p>
+        </w:tc>
+        <w:tc>
+          <w:tcPr>
+            <w:tcW w:type="dxa" w:w="2880"/>
+          </w:tcPr>
+          <w:p>
+            <w:r>
+              <w:rPr>
+                <w:sz w:val="21"/>
+              </w:rPr>
+            </w:r>
+            <w:r>
+              <w:rPr>
+                <w:b w:val="0"/>
+                <w:sz w:val="21"/>
+              </w:rPr>
+              <w:t>回合挂载</w:t>
+            </w:r>
+          </w:p>
+        </w:tc>
+        <w:tc>
+          <w:tcPr>
+            <w:tcW w:type="dxa" w:w="2880"/>
+          </w:tcPr>
+          <w:p>
+            <w:r>
+              <w:rPr>
+                <w:sz w:val="21"/>
+              </w:rPr>
+            </w:r>
+            <w:r>
+              <w:rPr>
+                <w:b w:val="0"/>
+                <w:sz w:val="21"/>
+              </w:rPr>
+              <w:t>向用户提问并等待回答（仅调度者）：单个问题或一表多问。只在真正需要用户拍板时用。</w:t>
+            </w:r>
+          </w:p>
+        </w:tc>
+      </w:tr>
+      <w:tr>
+        <w:tc>
+          <w:tcPr>
+            <w:tcW w:type="dxa" w:w="2880"/>
+          </w:tcPr>
+          <w:p>
+            <w:r>
+              <w:rPr>
+                <w:sz w:val="21"/>
+              </w:rPr>
+            </w:r>
+            <w:r>
+              <w:rPr>
+                <w:b w:val="0"/>
+                <w:sz w:val="21"/>
+              </w:rPr>
+              <w:t>todo</w:t>
+            </w:r>
+          </w:p>
+        </w:tc>
+        <w:tc>
+          <w:tcPr>
+            <w:tcW w:type="dxa" w:w="2880"/>
+          </w:tcPr>
+          <w:p>
+            <w:r>
+              <w:rPr>
+                <w:sz w:val="21"/>
+              </w:rPr>
+            </w:r>
+            <w:r>
+              <w:rPr>
+                <w:b w:val="0"/>
+                <w:sz w:val="21"/>
+              </w:rPr>
+              <w:t>回合挂载</w:t>
+            </w:r>
+          </w:p>
+        </w:tc>
+        <w:tc>
+          <w:tcPr>
+            <w:tcW w:type="dxa" w:w="2880"/>
+          </w:tcPr>
+          <w:p>
+            <w:r>
+              <w:rPr>
+                <w:sz w:val="21"/>
+              </w:rPr>
+            </w:r>
+            <w:r>
+              <w:rPr>
+                <w:b w:val="0"/>
+                <w:sz w:val="21"/>
+              </w:rPr>
+              <w:t>主人的共享日历待办（data/todos.json，GUI 日历同一份）：add / list / remove。信使靠它记住日期性承诺。</w:t>
+            </w:r>
+          </w:p>
+        </w:tc>
+      </w:tr>
+      <w:tr>
+        <w:tc>
+          <w:tcPr>
+            <w:tcW w:type="dxa" w:w="2880"/>
+          </w:tcPr>
+          <w:p>
+            <w:r>
+              <w:rPr>
+                <w:sz w:val="21"/>
+              </w:rPr>
+            </w:r>
+            <w:r>
+              <w:rPr>
+                <w:b w:val="0"/>
+                <w:sz w:val="21"/>
+              </w:rPr>
+              <w:t>diary</w:t>
+            </w:r>
+          </w:p>
+        </w:tc>
+        <w:tc>
+          <w:tcPr>
+            <w:tcW w:type="dxa" w:w="2880"/>
+          </w:tcPr>
+          <w:p>
+            <w:r>
+              <w:rPr>
+                <w:sz w:val="21"/>
+              </w:rPr>
+            </w:r>
+            <w:r>
+              <w:rPr>
+                <w:b w:val="0"/>
+                <w:sz w:val="21"/>
+              </w:rPr>
+              <w:t>回合挂载</w:t>
+            </w:r>
+          </w:p>
+        </w:tc>
+        <w:tc>
+          <w:tcPr>
+            <w:tcW w:type="dxa" w:w="2880"/>
+          </w:tcPr>
+          <w:p>
+            <w:r>
+              <w:rPr>
+                <w:sz w:val="21"/>
+              </w:rPr>
+            </w:r>
+            <w:r>
+              <w:rPr>
+                <w:b w:val="0"/>
+                <w:sz w:val="21"/>
+              </w:rPr>
+              <w:t>Agent 的私人日记（实验性开关，data/diary/）：write 记、read 读。没有 UI 出口，被问到也守口如瓶。</w:t>
+            </w:r>
+          </w:p>
+        </w:tc>
+      </w:tr>
+      <w:tr>
+        <w:tc>
+          <w:tcPr>
+            <w:tcW w:type="dxa" w:w="2880"/>
+          </w:tcPr>
+          <w:p>
+            <w:r>
+              <w:rPr>
+                <w:sz w:val="21"/>
+              </w:rPr>
+            </w:r>
+            <w:r>
+              <w:rPr>
+                <w:b w:val="0"/>
+                <w:sz w:val="21"/>
+              </w:rPr>
+              <w:t>skills</w:t>
+            </w:r>
+          </w:p>
+        </w:tc>
+        <w:tc>
+          <w:tcPr>
+            <w:tcW w:type="dxa" w:w="2880"/>
+          </w:tcPr>
+          <w:p>
+            <w:r>
+              <w:rPr>
+                <w:sz w:val="21"/>
+              </w:rPr>
+            </w:r>
+            <w:r>
+              <w:rPr>
+                <w:b w:val="0"/>
+                <w:sz w:val="21"/>
+              </w:rPr>
+              <w:t>回合挂载</w:t>
+            </w:r>
+          </w:p>
+        </w:tc>
+        <w:tc>
+          <w:tcPr>
+            <w:tcW w:type="dxa" w:w="2880"/>
+          </w:tcPr>
+          <w:p>
+            <w:r>
+              <w:rPr>
+                <w:sz w:val="21"/>
+              </w:rPr>
+            </w:r>
+            <w:r>
+              <w:rPr>
+                <w:b w:val="0"/>
+                <w:sz w:val="21"/>
+              </w:rPr>
+              <w:t>本机技能包（data/skills/）：list / read / save。让 Agent 沉淀可复用的做法。</w:t>
+            </w:r>
+          </w:p>
+        </w:tc>
+      </w:tr>
+      <w:tr>
+        <w:tc>
+          <w:tcPr>
+            <w:tcW w:type="dxa" w:w="2880"/>
+          </w:tcPr>
+          <w:p>
+            <w:r>
+              <w:rPr>
+                <w:sz w:val="21"/>
+              </w:rPr>
+            </w:r>
+            <w:r>
+              <w:rPr>
+                <w:b w:val="0"/>
+                <w:sz w:val="21"/>
+              </w:rPr>
+              <w:t>MCP 工具</w:t>
+            </w:r>
+          </w:p>
+        </w:tc>
+        <w:tc>
+          <w:tcPr>
+            <w:tcW w:type="dxa" w:w="2880"/>
+          </w:tcPr>
+          <w:p>
+            <w:r>
+              <w:rPr>
+                <w:sz w:val="21"/>
+              </w:rPr>
+            </w:r>
+            <w:r>
+              <w:rPr>
+                <w:b w:val="0"/>
+                <w:sz w:val="21"/>
+              </w:rPr>
+              <w:t>回合挂载</w:t>
+            </w:r>
+          </w:p>
+        </w:tc>
+        <w:tc>
+          <w:tcPr>
+            <w:tcW w:type="dxa" w:w="2880"/>
+          </w:tcPr>
+          <w:p>
+            <w:r>
+              <w:rPr>
+                <w:sz w:val="21"/>
+              </w:rPr>
+            </w:r>
+            <w:r>
+              <w:rPr>
+                <w:b w:val="0"/>
+                <w:sz w:val="21"/>
+              </w:rPr>
+              <w:t>config 里 mcp_servers 配的 MCP 服务器按需动态挂载，名字与功能由服务器决定。</w:t>
+            </w:r>
+          </w:p>
+        </w:tc>
+      </w:tr>
+    </w:tbl>
     <w:sectPr>
       <w:pgSz w:w="12240" w:h="15840"/>
       <w:pgMar w:top="1440" w:right="1800" w:bottom="1440" w:left="1800" w:header="720" w:footer="720" w:gutter="0"/>

</xml_diff>

<commit_message>
Show the firewall verdict instead of only warning when it is blocked
The warning row + allow button only ever appeared when the probe said blocked, so
a machine whose program is already allowed looked exactly like one without any
check at all: the user's exe has two inbound rules (one of them the one this
button created) and the page stayed silent, which reads as 'no such feature'.

Three states now: allowed prints one line saying so; blocked prints the reason,
shows the button, and raises UAC by itself once per page life (a cancelled
prompt is final, the button stays for retries); unknown stays silent. The top
hint no longer points at a row that may not exist.

The probe matches the program path as one whole string, so it can only be fed
os.path.realpath(sys.executable) — a forward-slash path silently matches zero
rules and reads as 'not allowed'.
</commit_message>
<xml_diff>
--- a/docs/README-详细版.docx
+++ b/docs/README-详细版.docx
@@ -2959,7 +2959,7 @@
         <w:rPr>
           <w:lang w:eastAsia="zh-CN"/>
         </w:rPr>
-        <w:t>页面看出来后会直接给一个「放行防火墙（手机才能连）」按钮，点它走</w:t>
+        <w:t>页面会一直显示入站连接放行与否，没放行时它自己发起一次</w:t>
       </w:r>
       <w:r>
         <w:rPr>
@@ -2971,7 +2971,7 @@
         <w:rPr>
           <w:lang w:eastAsia="zh-CN"/>
         </w:rPr>
-        <w:t>加规则，不用手敲命令。</w:t>
+        <w:t>把规则加上（取消过就留个按钮手动重试），不用手敲命令。</w:t>
       </w:r>
     </w:p>
     <w:p>

</xml_diff>